<commit_message>
Add window treatments quote, City bid staffing guide; fix blight PDF dollar amounts
- RFQ 548013 Window Treatments: quote letter with draft pricing and filled bid sheet
- Staffing and bid/no-bid guide for RFPs 549834, 548013, 550148 and 551200
- Rebuild the RFP 549834 docx/pdf so dollar amounts aren't parsed as math

Co-Authored-By: Claude Opus 5.5 <noreply@anthropic.com>
Claude-Session: https://claude.ai/code/session_016A3ouJbihSnm9jDKEjUJcG
</commit_message>
<xml_diff>
--- a/docs/HANDLED_PROPOSAL_RFP549834_BLIGHT_REMEDIATION_2026-10-23_1413.docx
+++ b/docs/HANDLED_PROPOSAL_RFP549834_BLIGHT_REMEDIATION_2026-10-23_1413.docx
@@ -646,123 +646,7 @@
               <w:jc w:val="left"/>
             </w:pPr>
             <w:r>
-              <w:t xml:space="preserve">EPA firm cert (</w:t>
-            </w:r>
-            <m:oMath>
-              <m:r>
-                <m:t>300</m:t>
-              </m:r>
-              <m:r>
-                <m:rPr>
-                  <m:sty m:val="p"/>
-                </m:rPr>
-                <m:t>,</m:t>
-              </m:r>
-              <m:r>
-                <m:t> </m:t>
-              </m:r>
-              <m:r>
-                <m:t>90</m:t>
-              </m:r>
-              <m:r>
-                <m:t>d</m:t>
-              </m:r>
-              <m:r>
-                <m:t>a</m:t>
-              </m:r>
-              <m:r>
-                <m:t>y</m:t>
-              </m:r>
-              <m:r>
-                <m:t>s</m:t>
-              </m:r>
-              <m:r>
-                <m:rPr>
-                  <m:sty m:val="p"/>
-                </m:rPr>
-                <m:t>)</m:t>
-              </m:r>
-              <m:r>
-                <m:rPr>
-                  <m:sty m:val="p"/>
-                </m:rPr>
-                <m:t>;</m:t>
-              </m:r>
-              <m:r>
-                <m:t>r</m:t>
-              </m:r>
-              <m:r>
-                <m:t>e</m:t>
-              </m:r>
-              <m:r>
-                <m:t>n</m:t>
-              </m:r>
-              <m:r>
-                <m:t>o</m:t>
-              </m:r>
-              <m:r>
-                <m:t>v</m:t>
-              </m:r>
-              <m:r>
-                <m:t>a</m:t>
-              </m:r>
-              <m:r>
-                <m:t>t</m:t>
-              </m:r>
-              <m:r>
-                <m:t>o</m:t>
-              </m:r>
-              <m:r>
-                <m:t>r</m:t>
-              </m:r>
-              <m:r>
-                <m:t>c</m:t>
-              </m:r>
-              <m:r>
-                <m:t>o</m:t>
-              </m:r>
-              <m:r>
-                <m:t>u</m:t>
-              </m:r>
-              <m:r>
-                <m:t>r</m:t>
-              </m:r>
-              <m:r>
-                <m:t>s</m:t>
-              </m:r>
-              <m:r>
-                <m:t>e</m:t>
-              </m:r>
-              <m:r>
-                <m:rPr>
-                  <m:sty m:val="p"/>
-                </m:rPr>
-                <m:t>(</m:t>
-              </m:r>
-              <m:r>
-                <m:t>1</m:t>
-              </m:r>
-              <m:r>
-                <m:t>d</m:t>
-              </m:r>
-              <m:r>
-                <m:t>a</m:t>
-              </m:r>
-              <m:r>
-                <m:t>y</m:t>
-              </m:r>
-              <m:r>
-                <m:rPr>
-                  <m:sty m:val="p"/>
-                </m:rPr>
-                <m:t>,</m:t>
-              </m:r>
-              <m:r>
-                <m:t> </m:t>
-              </m:r>
-            </m:oMath>
-            <w:r>
-              <w:t xml:space="preserve">250)</w:t>
+              <w:t xml:space="preserve">EPA firm cert ($300, ~90 days); renovator course (1 day, ~$250)</w:t>
             </w:r>
           </w:p>
         </w:tc>
@@ -985,27 +869,7 @@
         <w:t xml:space="preserve"> </w:t>
       </w:r>
       <w:r>
-        <w:t xml:space="preserve">auto $1M CSL; CGL $2M per occurrence / $4M aggregate; Michigan statutory workers' comp; employers' liability</w:t>
-      </w:r>
-      <w:r>
-        <w:t xml:space="preserve"> </w:t>
-      </w:r>
-      <m:oMath>
-        <m:r>
-          <m:t>500</m:t>
-        </m:r>
-        <m:r>
-          <m:t>k</m:t>
-        </m:r>
-        <m:r>
-          <m:rPr>
-            <m:sty m:val="p"/>
-          </m:rPr>
-          <m:t>/</m:t>
-        </m:r>
-      </m:oMath>
-      <w:r>
-        <w:t xml:space="preserve">500k/$500k;</w:t>
+        <w:t xml:space="preserve">auto $1M CSL; CGL $2M per occurrence / $4M aggregate; Michigan statutory workers' comp; employers' liability $500k/$500k/$500k;</w:t>
       </w:r>
       <w:r>
         <w:t xml:space="preserve"> </w:t>
@@ -4861,102 +4725,25 @@
       <w:r>
         <w:t xml:space="preserve"> </w:t>
       </w:r>
-      <m:oMath>
-        <m:d>
-          <m:dPr>
-            <m:begChr m:val="["/>
-            <m:endChr m:val="]"/>
-            <m:sepChr m:val=""/>
-            <m:grow/>
-          </m:dPr>
-          <m:e>
-            <m:r>
-              <m:t>19.00</m:t>
-            </m:r>
-          </m:e>
-        </m:d>
-        <m:r>
-          <m:rPr>
-            <m:sty m:val="p"/>
-          </m:rPr>
-          <m:t>*</m:t>
-        </m:r>
-        <m:r>
-          <m:rPr>
-            <m:sty m:val="p"/>
-          </m:rPr>
-          <m:t>*</m:t>
-        </m:r>
-        <m:r>
-          <m:rPr>
-            <m:sty m:val="p"/>
-          </m:rPr>
-          <m:t>/</m:t>
-        </m:r>
-        <m:r>
-          <m:t>h</m:t>
-        </m:r>
-        <m:r>
-          <m:t>o</m:t>
-        </m:r>
-        <m:r>
-          <m:t>u</m:t>
-        </m:r>
-        <m:r>
-          <m:t>r</m:t>
-        </m:r>
-        <m:r>
-          <m:rPr>
-            <m:sty m:val="p"/>
-          </m:rPr>
-          <m:t>;</m:t>
-        </m:r>
-        <m:r>
-          <m:t>c</m:t>
-        </m:r>
-        <m:r>
-          <m:t>r</m:t>
-        </m:r>
-        <m:r>
-          <m:t>e</m:t>
-        </m:r>
-        <m:r>
-          <m:t>w</m:t>
-        </m:r>
-        <m:r>
-          <m:t>l</m:t>
-        </m:r>
-        <m:r>
-          <m:t>e</m:t>
-        </m:r>
-        <m:r>
-          <m:t>a</m:t>
-        </m:r>
-        <m:r>
-          <m:t>d</m:t>
-        </m:r>
-        <m:r>
-          <m:t>s</m:t>
-        </m:r>
-        <m:r>
-          <m:rPr>
-            <m:sty m:val="p"/>
-          </m:rPr>
-          <m:t>*</m:t>
-        </m:r>
-        <m:r>
-          <m:rPr>
-            <m:sty m:val="p"/>
-          </m:rPr>
-          <m:t>*</m:t>
-        </m:r>
-      </m:oMath>
       <w:r>
         <w:rPr>
           <w:bCs/>
           <w:b/>
         </w:rPr>
-        <w:t xml:space="preserve">[24.00]</w:t>
+        <w:t xml:space="preserve">$[19.00]</w:t>
+      </w:r>
+      <w:r>
+        <w:t xml:space="preserve">/hour; crew leads</w:t>
+      </w:r>
+      <w:r>
+        <w:t xml:space="preserve"> </w:t>
+      </w:r>
+      <w:r>
+        <w:rPr>
+          <w:bCs/>
+          <w:b/>
+        </w:rPr>
+        <w:t xml:space="preserve">$[24.00]</w:t>
       </w:r>
       <w:r>
         <w:t xml:space="preserve">/hour; supervisors</w:t>
@@ -7995,223 +7782,7 @@
         <w:t xml:space="preserve"> </w:t>
       </w:r>
       <w:r>
-        <w:t xml:space="preserve">4-person crew at a loaded ~</w:t>
-      </w:r>
-      <m:oMath>
-        <m:r>
-          <m:t>31</m:t>
-        </m:r>
-        <m:r>
-          <m:rPr>
-            <m:sty m:val="p"/>
-          </m:rPr>
-          <m:t>/</m:t>
-        </m:r>
-        <m:r>
-          <m:t>h</m:t>
-        </m:r>
-        <m:r>
-          <m:t>o</m:t>
-        </m:r>
-        <m:r>
-          <m:t>u</m:t>
-        </m:r>
-        <m:r>
-          <m:t>r</m:t>
-        </m:r>
-        <m:r>
-          <m:t>p</m:t>
-        </m:r>
-        <m:r>
-          <m:t>e</m:t>
-        </m:r>
-        <m:r>
-          <m:t>r</m:t>
-        </m:r>
-        <m:r>
-          <m:t>w</m:t>
-        </m:r>
-        <m:r>
-          <m:t>o</m:t>
-        </m:r>
-        <m:r>
-          <m:t>r</m:t>
-        </m:r>
-        <m:r>
-          <m:t>k</m:t>
-        </m:r>
-        <m:r>
-          <m:t>e</m:t>
-        </m:r>
-        <m:r>
-          <m:t>r</m:t>
-        </m:r>
-        <m:d>
-          <m:dPr>
-            <m:begChr m:val="("/>
-            <m:endChr m:val=")"/>
-            <m:sepChr m:val=""/>
-            <m:grow/>
-          </m:dPr>
-          <m:e>
-            <m:r>
-              <m:t>w</m:t>
-            </m:r>
-            <m:r>
-              <m:t>a</m:t>
-            </m:r>
-            <m:r>
-              <m:t>g</m:t>
-            </m:r>
-            <m:r>
-              <m:t>e</m:t>
-            </m:r>
-            <m:r>
-              <m:rPr>
-                <m:sty m:val="p"/>
-              </m:rPr>
-              <m:t>+</m:t>
-            </m:r>
-            <m:r>
-              <m:t>p</m:t>
-            </m:r>
-            <m:r>
-              <m:t>a</m:t>
-            </m:r>
-            <m:r>
-              <m:t>y</m:t>
-            </m:r>
-            <m:r>
-              <m:t>r</m:t>
-            </m:r>
-            <m:r>
-              <m:t>o</m:t>
-            </m:r>
-            <m:r>
-              <m:t>l</m:t>
-            </m:r>
-            <m:r>
-              <m:t>l</m:t>
-            </m:r>
-            <m:r>
-              <m:t>t</m:t>
-            </m:r>
-            <m:r>
-              <m:t>a</m:t>
-            </m:r>
-            <m:r>
-              <m:t>x</m:t>
-            </m:r>
-            <m:r>
-              <m:rPr>
-                <m:sty m:val="p"/>
-              </m:rPr>
-              <m:t>+</m:t>
-            </m:r>
-            <m:r>
-              <m:t>w</m:t>
-            </m:r>
-            <m:r>
-              <m:t>o</m:t>
-            </m:r>
-            <m:r>
-              <m:t>r</m:t>
-            </m:r>
-            <m:r>
-              <m:t>k</m:t>
-            </m:r>
-            <m:r>
-              <m:t>e</m:t>
-            </m:r>
-            <m:r>
-              <m:t>r</m:t>
-            </m:r>
-            <m:r>
-              <m:t>s</m:t>
-            </m:r>
-            <m:r>
-              <m:rPr>
-                <m:sty m:val="p"/>
-              </m:rPr>
-              <m:t>′</m:t>
-            </m:r>
-            <m:r>
-              <m:t>c</m:t>
-            </m:r>
-            <m:r>
-              <m:t>o</m:t>
-            </m:r>
-            <m:r>
-              <m:t>m</m:t>
-            </m:r>
-            <m:r>
-              <m:t>p</m:t>
-            </m:r>
-            <m:r>
-              <m:rPr>
-                <m:sty m:val="p"/>
-              </m:rPr>
-              <m:t>+</m:t>
-            </m:r>
-            <m:r>
-              <m:t>P</m:t>
-            </m:r>
-            <m:r>
-              <m:t>P</m:t>
-            </m:r>
-            <m:r>
-              <m:t>E</m:t>
-            </m:r>
-            <m:r>
-              <m:rPr>
-                <m:sty m:val="p"/>
-              </m:rPr>
-              <m:t>/</m:t>
-            </m:r>
-            <m:r>
-              <m:t>t</m:t>
-            </m:r>
-            <m:r>
-              <m:t>r</m:t>
-            </m:r>
-            <m:r>
-              <m:t>a</m:t>
-            </m:r>
-            <m:r>
-              <m:t>i</m:t>
-            </m:r>
-            <m:r>
-              <m:t>n</m:t>
-            </m:r>
-            <m:r>
-              <m:t>i</m:t>
-            </m:r>
-            <m:r>
-              <m:t>n</m:t>
-            </m:r>
-            <m:r>
-              <m:t>g</m:t>
-            </m:r>
-          </m:e>
-        </m:d>
-        <m:r>
-          <m:rPr>
-            <m:sty m:val="p"/>
-          </m:rPr>
-          <m:t>,</m:t>
-        </m:r>
-        <m:r>
-          <m:t>s</m:t>
-        </m:r>
-        <m:r>
-          <m:t>o</m:t>
-        </m:r>
-        <m:r>
-          <m:t> </m:t>
-        </m:r>
-      </m:oMath>
-      <w:r>
-        <w:t xml:space="preserve">124 per crew-hour in labor. Truck, trailer, fuel and small equipment add ~$45 per crew-hour. Overhead (insurance incl. pollution, supervision, documentation) adds 18%. Target margin 15–20%.</w:t>
+        <w:t xml:space="preserve">4-person crew at a loaded ~$31/hour per worker (wage + payroll tax + workers' comp + PPE/training), so ~$124 per crew-hour in labor. Truck, trailer, fuel and small equipment add ~$45 per crew-hour. Overhead (insurance incl. pollution, supervision, documentation) adds 18%. Target margin 15–20%.</w:t>
       </w:r>
     </w:p>
     <w:p>
@@ -8233,41 +7804,7 @@
         <w:t xml:space="preserve"> </w:t>
       </w:r>
       <w:r>
-        <w:t xml:space="preserve">metro Detroit landfill / transfer tipping about</w:t>
-      </w:r>
-      <w:r>
-        <w:t xml:space="preserve"> </w:t>
-      </w:r>
-      <m:oMath>
-        <m:r>
-          <m:t>45</m:t>
-        </m:r>
-        <m:r>
-          <m:rPr>
-            <m:sty m:val="p"/>
-          </m:rPr>
-          <m:t>–</m:t>
-        </m:r>
-      </m:oMath>
-      <w:r>
-        <w:t xml:space="preserve">65 per ton. Mixed debris runs about 0.3–0.5 ton per cubic yard, so roughly</w:t>
-      </w:r>
-      <w:r>
-        <w:t xml:space="preserve"> </w:t>
-      </w:r>
-      <m:oMath>
-        <m:r>
-          <m:t>15</m:t>
-        </m:r>
-        <m:r>
-          <m:rPr>
-            <m:sty m:val="p"/>
-          </m:rPr>
-          <m:t>–</m:t>
-        </m:r>
-      </m:oMath>
-      <w:r>
-        <w:t xml:space="preserve">30 per cubic yard in fees before labor and hauling.</w:t>
+        <w:t xml:space="preserve">metro Detroit landfill / transfer tipping about $45–$65 per ton. Mixed debris runs about 0.3–0.5 ton per cubic yard, so roughly $15–$30 per cubic yard in fees before labor and hauling.</w:t>
       </w:r>
     </w:p>
     <w:p>

</xml_diff>